<commit_message>
Fix two layout problems and one key wording in the final-exam bank
- C4-6, C4-7: the SQL query was part of the stem text, so Word showed it
  on the same line; it now sits in the code block with the data.
- C5-25: the key now states the trigger risks as DSC 5.3 gives them
  (chains of triggers, unintended firing when loading data from a backup).
- The option shuffle can use a 'seed' field, so a reworded stem keeps its
  answer letter; all 400 answer letters are unchanged.

Co-Authored-By: Claude Opus 5.5 <noreply@anthropic.com>
Claude-Session: https://claude.ai/code/session_0157NQpBHkydaVuWPpDtVnkB
</commit_message>
<xml_diff>
--- a/materials/questions/out/IDB201_Final_Exam_Question_Bank.docx
+++ b/materials/questions/out/IDB201_Final_Exam_Question_Bank.docx
@@ -18551,9 +18551,7 @@
         <w:t xml:space="preserve">127. </w:t>
       </w:r>
       <w:r>
-        <w:t xml:space="preserve">How many rows does the query return?
-select * from student left outer join takes
-  on student.ID = takes.ID and takes.year = 2019</w:t>
+        <w:t xml:space="preserve">How many rows does the query return?</w:t>
       </w:r>
     </w:p>
     <w:p>
@@ -18574,6 +18572,51 @@
     <w:p>
       <w:pPr>
         <w:shd w:fill="F4F6F7" w:color="auto" w:val="clear"/>
+        <w:spacing w:after="0" w:before="0" w:line="240"/>
+        <w:ind w:left="113" w:right="113"/>
+      </w:pPr>
+      <w:r>
+        <w:rPr>
+          <w:rFonts w:ascii="Courier New" w:cs="Courier New" w:eastAsia="Courier New" w:hAnsi="Courier New"/>
+          <w:sz w:val="18"/>
+          <w:szCs w:val="18"/>
+        </w:rPr>
+        <w:t xml:space="preserve">takes(ID, course_id, year): (S1, C1, 2018), (S1, C2, 2019), (S2, C1, 2019)</w:t>
+      </w:r>
+    </w:p>
+    <w:p>
+      <w:pPr>
+        <w:shd w:fill="F4F6F7" w:color="auto" w:val="clear"/>
+        <w:spacing w:after="0" w:before="0" w:line="240"/>
+        <w:ind w:left="113" w:right="113"/>
+      </w:pPr>
+      <w:r>
+        <w:rPr>
+          <w:rFonts w:ascii="Courier New" w:cs="Courier New" w:eastAsia="Courier New" w:hAnsi="Courier New"/>
+          <w:sz w:val="18"/>
+          <w:szCs w:val="18"/>
+        </w:rPr>
+        <w:t xml:space="preserve"> </w:t>
+      </w:r>
+    </w:p>
+    <w:p>
+      <w:pPr>
+        <w:shd w:fill="F4F6F7" w:color="auto" w:val="clear"/>
+        <w:spacing w:after="0" w:before="0" w:line="240"/>
+        <w:ind w:left="113" w:right="113"/>
+      </w:pPr>
+      <w:r>
+        <w:rPr>
+          <w:rFonts w:ascii="Courier New" w:cs="Courier New" w:eastAsia="Courier New" w:hAnsi="Courier New"/>
+          <w:sz w:val="18"/>
+          <w:szCs w:val="18"/>
+        </w:rPr>
+        <w:t xml:space="preserve">select * from student left outer join takes</w:t>
+      </w:r>
+    </w:p>
+    <w:p>
+      <w:pPr>
+        <w:shd w:fill="F4F6F7" w:color="auto" w:val="clear"/>
         <w:spacing w:after="120" w:before="0" w:line="240"/>
         <w:ind w:left="113" w:right="113"/>
       </w:pPr>
@@ -18583,7 +18626,7 @@
           <w:sz w:val="18"/>
           <w:szCs w:val="18"/>
         </w:rPr>
-        <w:t xml:space="preserve">takes(ID, course_id, year): (S1, C1, 2018), (S1, C2, 2019), (S2, C1, 2019)</w:t>
+        <w:t xml:space="preserve">  on student.ID = takes.ID and takes.year = 2019</w:t>
       </w:r>
     </w:p>
     <w:p>
@@ -18689,10 +18732,7 @@
         <w:t xml:space="preserve">128. </w:t>
       </w:r>
       <w:r>
-        <w:t xml:space="preserve">How many rows does the query return?
-select * from student left outer join takes
-  on student.ID = takes.ID
-where takes.year = 2019</w:t>
+        <w:t xml:space="preserve">How many rows does the query return?</w:t>
       </w:r>
     </w:p>
     <w:p>
@@ -18713,6 +18753,66 @@
     <w:p>
       <w:pPr>
         <w:shd w:fill="F4F6F7" w:color="auto" w:val="clear"/>
+        <w:spacing w:after="0" w:before="0" w:line="240"/>
+        <w:ind w:left="113" w:right="113"/>
+      </w:pPr>
+      <w:r>
+        <w:rPr>
+          <w:rFonts w:ascii="Courier New" w:cs="Courier New" w:eastAsia="Courier New" w:hAnsi="Courier New"/>
+          <w:sz w:val="18"/>
+          <w:szCs w:val="18"/>
+        </w:rPr>
+        <w:t xml:space="preserve">takes(ID, course_id, year): (S1, C1, 2018), (S1, C2, 2019), (S2, C1, 2019)</w:t>
+      </w:r>
+    </w:p>
+    <w:p>
+      <w:pPr>
+        <w:shd w:fill="F4F6F7" w:color="auto" w:val="clear"/>
+        <w:spacing w:after="0" w:before="0" w:line="240"/>
+        <w:ind w:left="113" w:right="113"/>
+      </w:pPr>
+      <w:r>
+        <w:rPr>
+          <w:rFonts w:ascii="Courier New" w:cs="Courier New" w:eastAsia="Courier New" w:hAnsi="Courier New"/>
+          <w:sz w:val="18"/>
+          <w:szCs w:val="18"/>
+        </w:rPr>
+        <w:t xml:space="preserve"> </w:t>
+      </w:r>
+    </w:p>
+    <w:p>
+      <w:pPr>
+        <w:shd w:fill="F4F6F7" w:color="auto" w:val="clear"/>
+        <w:spacing w:after="0" w:before="0" w:line="240"/>
+        <w:ind w:left="113" w:right="113"/>
+      </w:pPr>
+      <w:r>
+        <w:rPr>
+          <w:rFonts w:ascii="Courier New" w:cs="Courier New" w:eastAsia="Courier New" w:hAnsi="Courier New"/>
+          <w:sz w:val="18"/>
+          <w:szCs w:val="18"/>
+        </w:rPr>
+        <w:t xml:space="preserve">select * from student left outer join takes</w:t>
+      </w:r>
+    </w:p>
+    <w:p>
+      <w:pPr>
+        <w:shd w:fill="F4F6F7" w:color="auto" w:val="clear"/>
+        <w:spacing w:after="0" w:before="0" w:line="240"/>
+        <w:ind w:left="113" w:right="113"/>
+      </w:pPr>
+      <w:r>
+        <w:rPr>
+          <w:rFonts w:ascii="Courier New" w:cs="Courier New" w:eastAsia="Courier New" w:hAnsi="Courier New"/>
+          <w:sz w:val="18"/>
+          <w:szCs w:val="18"/>
+        </w:rPr>
+        <w:t xml:space="preserve">  on student.ID = takes.ID</w:t>
+      </w:r>
+    </w:p>
+    <w:p>
+      <w:pPr>
+        <w:shd w:fill="F4F6F7" w:color="auto" w:val="clear"/>
         <w:spacing w:after="120" w:before="0" w:line="240"/>
         <w:ind w:left="113" w:right="113"/>
       </w:pPr>
@@ -18722,7 +18822,7 @@
           <w:sz w:val="18"/>
           <w:szCs w:val="18"/>
         </w:rPr>
-        <w:t xml:space="preserve">takes(ID, course_id, year): (S1, C1, 2018), (S1, C2, 2019), (S2, C1, 2019)</w:t>
+        <w:t xml:space="preserve">where takes.year = 2019</w:t>
       </w:r>
     </w:p>
     <w:p>
@@ -25096,7 +25196,7 @@
         <w:t xml:space="preserve">C. </w:t>
       </w:r>
       <w:r>
-        <w:t xml:space="preserve">Triggers can fire other triggers, and their effects are hidden from the statements that cause them</w:t>
+        <w:t xml:space="preserve">Triggers can set off a chain of other triggers, and they may run unintentionally, e.g. when data is loaded from a backup</w:t>
       </w:r>
     </w:p>
     <w:p>

</xml_diff>